<commit_message>
feat: address all supervisor review comments, update figures, and resolve math font glyph issues
</commit_message>
<xml_diff>
--- a/thesis_latex_source/word-build/reference.docx
+++ b/thesis_latex_source/word-build/reference.docx
@@ -378,13 +378,14 @@
     <w:pPr>
       <w:bidi w:val="1"/>
       <w:spacing w:lineRule="auto" w:line="324" w:after="80"/>
-      <w:jc w:val="right"/>
+      <w:jc w:val="both"/>
     </w:pPr>
     <w:rPr>
       <w:rFonts w:ascii="Calibri" w:hAnsi="Calibri" w:cs="B Lotus"/>
       <w:b w:val="0"/>
       <w:sz w:val="25"/>
       <w:rtl w:val="1"/>
+      <w:lang w:bidi="fa-IR"/>
     </w:rPr>
   </w:style>
   <w:style w:type="paragraph" w:styleId="Header">
@@ -451,10 +452,11 @@
       <w:rFonts w:asciiTheme="majorHAnsi" w:eastAsiaTheme="majorEastAsia" w:hAnsiTheme="majorHAnsi" w:cstheme="majorBidi" w:ascii="Calibri" w:hAnsi="Calibri" w:cs="B Lotus"/>
       <w:b/>
       <w:bCs/>
-      <w:color w:val="003366"/>
+      <w:color w:val="000000"/>
       <w:sz w:val="36"/>
       <w:szCs w:val="28"/>
       <w:rtl w:val="1"/>
+      <w:lang w:bidi="fa-IR"/>
     </w:rPr>
   </w:style>
   <w:style w:type="paragraph" w:styleId="Heading2">
@@ -478,10 +480,11 @@
       <w:rFonts w:asciiTheme="majorHAnsi" w:eastAsiaTheme="majorEastAsia" w:hAnsiTheme="majorHAnsi" w:cstheme="majorBidi" w:ascii="Calibri" w:hAnsi="Calibri" w:cs="B Lotus"/>
       <w:b/>
       <w:bCs/>
-      <w:color w:val="004682"/>
+      <w:color w:val="000000"/>
       <w:sz w:val="30"/>
       <w:szCs w:val="26"/>
       <w:rtl w:val="1"/>
+      <w:lang w:bidi="fa-IR"/>
     </w:rPr>
   </w:style>
   <w:style w:type="paragraph" w:styleId="Heading3">
@@ -505,9 +508,10 @@
       <w:rFonts w:asciiTheme="majorHAnsi" w:eastAsiaTheme="majorEastAsia" w:hAnsiTheme="majorHAnsi" w:cstheme="majorBidi" w:ascii="Calibri" w:hAnsi="Calibri" w:cs="B Lotus"/>
       <w:b/>
       <w:bCs/>
-      <w:color w:val="323232"/>
+      <w:color w:val="000000"/>
       <w:sz w:val="27"/>
       <w:rtl w:val="1"/>
+      <w:lang w:bidi="fa-IR"/>
     </w:rPr>
   </w:style>
   <w:style w:type="paragraph" w:styleId="Heading4">
@@ -523,16 +527,21 @@
     <w:pPr>
       <w:keepNext/>
       <w:keepLines/>
-      <w:spacing w:before="200" w:after="0"/>
+      <w:spacing w:before="160" w:after="80"/>
+      <w:jc w:val="right"/>
       <w:outlineLvl w:val="3"/>
+      <w:bidi w:val="1"/>
     </w:pPr>
     <w:rPr>
-      <w:rFonts w:asciiTheme="majorHAnsi" w:eastAsiaTheme="majorEastAsia" w:hAnsiTheme="majorHAnsi" w:cstheme="majorBidi"/>
+      <w:rFonts w:asciiTheme="majorHAnsi" w:eastAsiaTheme="majorEastAsia" w:hAnsiTheme="majorHAnsi" w:cstheme="majorBidi" w:ascii="Calibri" w:hAnsi="Calibri" w:cs="B Lotus"/>
       <w:b/>
       <w:bCs/>
-      <w:i/>
+      <w:i w:val="0"/>
       <w:iCs/>
-      <w:color w:val="4F81BD" w:themeColor="accent1"/>
+      <w:color w:val="000000"/>
+      <w:sz w:val="25"/>
+      <w:rtl w:val="1"/>
+      <w:lang w:bidi="fa-IR"/>
     </w:rPr>
   </w:style>
   <w:style w:type="paragraph" w:styleId="Heading5">
@@ -826,8 +835,17 @@
     <w:unhideWhenUsed/>
     <w:rsid w:val="00AA1D8D"/>
     <w:pPr>
-      <w:spacing w:after="120"/>
-    </w:pPr>
+      <w:spacing w:after="80" w:lineRule="auto" w:line="324"/>
+      <w:bidi w:val="1"/>
+      <w:jc w:val="both"/>
+    </w:pPr>
+    <w:rPr>
+      <w:rFonts w:ascii="Calibri" w:hAnsi="Calibri" w:cs="B Lotus"/>
+      <w:b w:val="0"/>
+      <w:sz w:val="25"/>
+      <w:rtl w:val="1"/>
+      <w:lang w:bidi="fa-IR"/>
+    </w:rPr>
   </w:style>
   <w:style w:type="character" w:customStyle="1" w:styleId="BodyTextChar">
     <w:name w:val="Body Text Char"/>
@@ -1196,6 +1214,7 @@
       <w:sz w:val="21"/>
       <w:szCs w:val="18"/>
       <w:rtl w:val="1"/>
+      <w:lang w:bidi="fa-IR"/>
     </w:rPr>
   </w:style>
   <w:style w:type="character" w:styleId="Strong">
@@ -12096,6 +12115,7 @@
       <w:color w:val="3C3C3C"/>
       <w:sz w:val="21"/>
       <w:rtl w:val="1"/>
+      <w:lang w:bidi="fa-IR"/>
     </w:rPr>
   </w:style>
   <w:style w:type="paragraph" w:customStyle="1" w:styleId="CaptionFigure">
@@ -12111,6 +12131,42 @@
       <w:color w:val="3C3C3C"/>
       <w:sz w:val="21"/>
       <w:rtl w:val="1"/>
+      <w:lang w:bidi="fa-IR"/>
+    </w:rPr>
+  </w:style>
+  <w:style w:type="character" w:customStyle="1" w:styleId="FootnoteReference">
+    <w:name w:val="Footnote Reference"/>
+    <w:rPr>
+      <w:vertAlign w:val="superscript"/>
+      <w:rFonts w:ascii="Calibri" w:hAnsi="Calibri" w:cs="B Lotus"/>
+    </w:rPr>
+  </w:style>
+  <w:style w:type="paragraph" w:customStyle="1" w:styleId="FootnoteText">
+    <w:name w:val="Footnote Text"/>
+    <w:pPr>
+      <w:bidi w:val="1"/>
+      <w:spacing w:lineRule="auto" w:line="276" w:after="40"/>
+      <w:jc w:val="right"/>
+    </w:pPr>
+    <w:rPr>
+      <w:rFonts w:ascii="Calibri" w:hAnsi="Calibri" w:cs="B Lotus"/>
+      <w:b w:val="0"/>
+      <w:sz w:val="20"/>
+      <w:rtl w:val="1"/>
+      <w:lang w:bidi="fa-IR"/>
+    </w:rPr>
+  </w:style>
+  <w:style w:type="paragraph" w:customStyle="1" w:styleId="SourceCode">
+    <w:name w:val="SourceCode"/>
+    <w:pPr>
+      <w:spacing w:line="240" w:lineRule="auto" w:before="0" w:after="20"/>
+      <w:jc w:val="left"/>
+      <w:bidi w:val="0"/>
+    </w:pPr>
+    <w:rPr>
+      <w:rFonts w:ascii="Consolas" w:hAnsi="Consolas" w:cs="Consolas"/>
+      <w:sz w:val="17"/>
+      <w:rtl w:val="0"/>
     </w:rPr>
   </w:style>
 </w:styles>

</xml_diff>